<commit_message>
Correct Tier 4 documentation accuracy
</commit_message>
<xml_diff>
--- a/deliverables/Brain-Migration-Handoff.docx
+++ b/deliverables/Brain-Migration-Handoff.docx
@@ -2,6 +2,42 @@
 <file path=word/document.xml><?xml version="1.0" encoding="utf-8"?>
 <w:document xmlns:wpc="http://schemas.microsoft.com/office/word/2010/wordprocessingCanvas" xmlns:mc="http://schemas.openxmlformats.org/markup-compatibility/2006" xmlns:o="urn:schemas-microsoft-com:office:office" xmlns:r="http://schemas.openxmlformats.org/officeDocument/2006/relationships" xmlns:m="http://schemas.openxmlformats.org/officeDocument/2006/math" xmlns:v="urn:schemas-microsoft-com:vml" xmlns:wp14="http://schemas.microsoft.com/office/word/2010/wordprocessingDrawing" xmlns:wp="http://schemas.openxmlformats.org/drawingml/2006/wordprocessingDrawing" xmlns:w10="urn:schemas-microsoft-com:office:word" xmlns:w="http://schemas.openxmlformats.org/wordprocessingml/2006/main" xmlns:w14="http://schemas.microsoft.com/office/word/2010/wordml" xmlns:w15="http://schemas.microsoft.com/office/word/2012/wordml" xmlns:wpg="http://schemas.microsoft.com/office/word/2010/wordprocessingGroup" xmlns:wpi="http://schemas.microsoft.com/office/word/2010/wordprocessingInk" xmlns:wne="http://schemas.microsoft.com/office/word/2006/wordml" xmlns:wps="http://schemas.microsoft.com/office/word/2010/wordprocessingShape" xmlns:cx="http://schemas.microsoft.com/office/drawing/2014/chartex" xmlns:cx1="http://schemas.microsoft.com/office/drawing/2015/9/8/chartex" xmlns:cx2="http://schemas.microsoft.com/office/drawing/2015/10/21/chartex" xmlns:cx3="http://schemas.microsoft.com/office/drawing/2016/5/9/chartex" xmlns:cx4="http://schemas.microsoft.com/office/drawing/2016/5/10/chartex" xmlns:cx5="http://schemas.microsoft.com/office/drawing/2016/5/11/chartex" xmlns:cx6="http://schemas.microsoft.com/office/drawing/2016/5/12/chartex" xmlns:cx7="http://schemas.microsoft.com/office/drawing/2016/5/13/chartex" xmlns:cx8="http://schemas.microsoft.com/office/drawing/2016/5/14/chartex" xmlns:aink="http://schemas.microsoft.com/office/drawing/2016/ink" xmlns:am3d="http://schemas.microsoft.com/office/drawing/2017/model3d" xmlns:w16cex="http://schemas.microsoft.com/office/word/2018/wordml/cex" xmlns:w16cid="http://schemas.microsoft.com/office/word/2016/wordml/cid" xmlns:w16="http://schemas.microsoft.com/office/word/2018/wordml" xmlns:w16sdtdh="http://schemas.microsoft.com/office/word/2020/wordml/sdtdatahash" xmlns:w16se="http://schemas.microsoft.com/office/word/2015/wordml/symex" mc:Ignorable="w14 w15 wp14">
   <w:body>
+    <w:p>
+      <w:pPr>
+        <w:spacing w:before="80" w:after="80"/>
+        <w:jc w:val="left"/>
+        <w:shd w:fill="FFF2CC"/>
+      </w:pPr>
+      <w:r>
+        <w:rPr>
+          <w:rFonts w:ascii="Arial" w:hAnsi="Arial" w:eastAsia="Arial"/>
+          <w:b/>
+          <w:color w:val="603100"/>
+          <w:sz w:val="28"/>
+        </w:rPr>
+        <w:t>STALE ARCHITECTURE NOTICE - 2026-07-17</w:t>
+      </w:r>
+    </w:p>
+    <w:p>
+      <w:pPr>
+        <w:spacing w:after="120"/>
+      </w:pPr>
+    </w:p>
+    <w:p>
+      <w:pPr>
+        <w:spacing w:before="80" w:after="80"/>
+        <w:jc w:val="left"/>
+        <w:shd w:fill="FFF2CC"/>
+      </w:pPr>
+      <w:r>
+        <w:rPr>
+          <w:rFonts w:ascii="Arial" w:hAnsi="Arial" w:eastAsia="Arial"/>
+          <w:color w:val="603100"/>
+          <w:sz w:val="20"/>
+        </w:rPr>
+        <w:t>This migration document is historical. Its Crossmint/WireX architecture no longer reflects the BrainMVB codebase. Crossmint was removed, and the client no longer implements the described architecture for real cards, real bank accounts, or real stablecoin balances. Use current source files and README/replit documentation instead.</w:t>
+      </w:r>
+    </w:p>
     <w:p>
       <w:pPr>
         <w:spacing w:after="200" w:before="2400"/>

</xml_diff>

<commit_message>
Correct Tier 4 documentation accuracy (#13)
Co-authored-by: Damon <damon@Damons-MacBook-Air-2.local>
</commit_message>
<xml_diff>
--- a/deliverables/Brain-Migration-Handoff.docx
+++ b/deliverables/Brain-Migration-Handoff.docx
@@ -2,6 +2,42 @@
 <file path=word/document.xml><?xml version="1.0" encoding="utf-8"?>
 <w:document xmlns:wpc="http://schemas.microsoft.com/office/word/2010/wordprocessingCanvas" xmlns:mc="http://schemas.openxmlformats.org/markup-compatibility/2006" xmlns:o="urn:schemas-microsoft-com:office:office" xmlns:r="http://schemas.openxmlformats.org/officeDocument/2006/relationships" xmlns:m="http://schemas.openxmlformats.org/officeDocument/2006/math" xmlns:v="urn:schemas-microsoft-com:vml" xmlns:wp14="http://schemas.microsoft.com/office/word/2010/wordprocessingDrawing" xmlns:wp="http://schemas.openxmlformats.org/drawingml/2006/wordprocessingDrawing" xmlns:w10="urn:schemas-microsoft-com:office:word" xmlns:w="http://schemas.openxmlformats.org/wordprocessingml/2006/main" xmlns:w14="http://schemas.microsoft.com/office/word/2010/wordml" xmlns:w15="http://schemas.microsoft.com/office/word/2012/wordml" xmlns:wpg="http://schemas.microsoft.com/office/word/2010/wordprocessingGroup" xmlns:wpi="http://schemas.microsoft.com/office/word/2010/wordprocessingInk" xmlns:wne="http://schemas.microsoft.com/office/word/2006/wordml" xmlns:wps="http://schemas.microsoft.com/office/word/2010/wordprocessingShape" xmlns:cx="http://schemas.microsoft.com/office/drawing/2014/chartex" xmlns:cx1="http://schemas.microsoft.com/office/drawing/2015/9/8/chartex" xmlns:cx2="http://schemas.microsoft.com/office/drawing/2015/10/21/chartex" xmlns:cx3="http://schemas.microsoft.com/office/drawing/2016/5/9/chartex" xmlns:cx4="http://schemas.microsoft.com/office/drawing/2016/5/10/chartex" xmlns:cx5="http://schemas.microsoft.com/office/drawing/2016/5/11/chartex" xmlns:cx6="http://schemas.microsoft.com/office/drawing/2016/5/12/chartex" xmlns:cx7="http://schemas.microsoft.com/office/drawing/2016/5/13/chartex" xmlns:cx8="http://schemas.microsoft.com/office/drawing/2016/5/14/chartex" xmlns:aink="http://schemas.microsoft.com/office/drawing/2016/ink" xmlns:am3d="http://schemas.microsoft.com/office/drawing/2017/model3d" xmlns:w16cex="http://schemas.microsoft.com/office/word/2018/wordml/cex" xmlns:w16cid="http://schemas.microsoft.com/office/word/2016/wordml/cid" xmlns:w16="http://schemas.microsoft.com/office/word/2018/wordml" xmlns:w16sdtdh="http://schemas.microsoft.com/office/word/2020/wordml/sdtdatahash" xmlns:w16se="http://schemas.microsoft.com/office/word/2015/wordml/symex" mc:Ignorable="w14 w15 wp14">
   <w:body>
+    <w:p>
+      <w:pPr>
+        <w:spacing w:before="80" w:after="80"/>
+        <w:jc w:val="left"/>
+        <w:shd w:fill="FFF2CC"/>
+      </w:pPr>
+      <w:r>
+        <w:rPr>
+          <w:rFonts w:ascii="Arial" w:hAnsi="Arial" w:eastAsia="Arial"/>
+          <w:b/>
+          <w:color w:val="603100"/>
+          <w:sz w:val="28"/>
+        </w:rPr>
+        <w:t>STALE ARCHITECTURE NOTICE - 2026-07-17</w:t>
+      </w:r>
+    </w:p>
+    <w:p>
+      <w:pPr>
+        <w:spacing w:after="120"/>
+      </w:pPr>
+    </w:p>
+    <w:p>
+      <w:pPr>
+        <w:spacing w:before="80" w:after="80"/>
+        <w:jc w:val="left"/>
+        <w:shd w:fill="FFF2CC"/>
+      </w:pPr>
+      <w:r>
+        <w:rPr>
+          <w:rFonts w:ascii="Arial" w:hAnsi="Arial" w:eastAsia="Arial"/>
+          <w:color w:val="603100"/>
+          <w:sz w:val="20"/>
+        </w:rPr>
+        <w:t>This migration document is historical. Its Crossmint/WireX architecture no longer reflects the BrainMVB codebase. Crossmint was removed, and the client no longer implements the described architecture for real cards, real bank accounts, or real stablecoin balances. Use current source files and README/replit documentation instead.</w:t>
+      </w:r>
+    </w:p>
     <w:p>
       <w:pPr>
         <w:spacing w:after="200" w:before="2400"/>

</xml_diff>